<commit_message>
feat(lesson-03): slide «Подорож у пам'ять» — iPad → board → memory chip → cells, bytes from buckets
Co-Authored-By: Claude Sonnet 5.5 <noreply@anthropic.com>
</commit_message>
<xml_diff>
--- a/lesson-03-loops/Урок-3-теорія-для-вчителя.docx
+++ b/lesson-03-loops/Урок-3-теорія-для-вчителя.docx
@@ -246,7 +246,7 @@
             <w:rStyle w:val="Hyperlink"/>
             <w:noProof/>
           </w:rPr>
-          <w:t>Слайд 4 · Цикл</w:t>
+          <w:t>Слайд 4 · Подорож у пам’ять</w:t>
         </w:r>
       </w:hyperlink>
     </w:p>
@@ -263,7 +263,7 @@
             <w:rStyle w:val="Hyperlink"/>
             <w:noProof/>
           </w:rPr>
-          <w:t>Слайд 5 · Мільярд кроків</w:t>
+          <w:t>Слайд 5 · Цикл</w:t>
         </w:r>
       </w:hyperlink>
     </w:p>
@@ -280,7 +280,7 @@
             <w:rStyle w:val="Hyperlink"/>
             <w:noProof/>
           </w:rPr>
-          <w:t>Слайд 6 · Як процесор повторює</w:t>
+          <w:t>Слайд 6 · Мільярд кроків</w:t>
         </w:r>
       </w:hyperlink>
     </w:p>
@@ -297,7 +297,7 @@
             <w:rStyle w:val="Hyperlink"/>
             <w:noProof/>
           </w:rPr>
-          <w:t>Слайд 7 · iPad крутиться в циклі</w:t>
+          <w:t>Слайд 7 · Як процесор повторює</w:t>
         </w:r>
       </w:hyperlink>
     </w:p>
@@ -314,7 +314,7 @@
             <w:rStyle w:val="Hyperlink"/>
             <w:noProof/>
           </w:rPr>
-          <w:t>Слайд 8 · Перевір себе</w:t>
+          <w:t>Слайд 8 · iPad крутиться в циклі</w:t>
         </w:r>
       </w:hyperlink>
     </w:p>
@@ -331,7 +331,7 @@
             <w:rStyle w:val="Hyperlink"/>
             <w:noProof/>
           </w:rPr>
-          <w:t>Слайд 9 · Гра: Коридори (рівні 1–3)</w:t>
+          <w:t>Слайд 9 · Перевір себе</w:t>
         </w:r>
       </w:hyperlink>
     </w:p>
@@ -348,7 +348,7 @@
             <w:rStyle w:val="Hyperlink"/>
             <w:noProof/>
           </w:rPr>
-          <w:t>Слайд 10 · Гра: Візерунки (рівні 4–6)</w:t>
+          <w:t>Слайд 10 · Гра: Коридори (рівні 1–3)</w:t>
         </w:r>
       </w:hyperlink>
     </w:p>
@@ -365,7 +365,7 @@
             <w:rStyle w:val="Hyperlink"/>
             <w:noProof/>
           </w:rPr>
-          <w:t>Слайд 11 · Гра: Цикл у циклі (рівні 7–9)</w:t>
+          <w:t>Слайд 11 · Гра: Візерунки (рівні 4–6)</w:t>
         </w:r>
       </w:hyperlink>
     </w:p>
@@ -382,7 +382,7 @@
             <w:rStyle w:val="Hyperlink"/>
             <w:noProof/>
           </w:rPr>
-          <w:t>Слайд 12 · Гра: Бонус</w:t>
+          <w:t>Слайд 12 · Гра: Цикл у циклі (рівні 7–9)</w:t>
         </w:r>
       </w:hyperlink>
     </w:p>
@@ -399,7 +399,7 @@
             <w:rStyle w:val="Hyperlink"/>
             <w:noProof/>
           </w:rPr>
-          <w:t>Слайд 13 · Запам’ятай</w:t>
+          <w:t>Слайд 13 · Гра: Бонус</w:t>
         </w:r>
       </w:hyperlink>
     </w:p>
@@ -416,7 +416,7 @@
             <w:rStyle w:val="Hyperlink"/>
             <w:noProof/>
           </w:rPr>
-          <w:t>Слайд 14 · Посвідчення програміста</w:t>
+          <w:t>Слайд 14 · Запам’ятай</w:t>
         </w:r>
       </w:hyperlink>
     </w:p>
@@ -428,6 +428,23 @@
         </w:tabs>
       </w:pPr>
       <w:hyperlink w:anchor="_Toc300015" w:history="1">
+        <w:r>
+          <w:rPr>
+            <w:rStyle w:val="Hyperlink"/>
+            <w:noProof/>
+          </w:rPr>
+          <w:t>Слайд 15 · Посвідчення програміста</w:t>
+        </w:r>
+      </w:hyperlink>
+    </w:p>
+    <w:p>
+      <w:pPr>
+        <w:pStyle w:val="TOC1"/>
+        <w:tabs>
+          <w:tab w:val="right" w:leader="dot" w:pos="9016"/>
+        </w:tabs>
+      </w:pPr>
+      <w:hyperlink w:anchor="_Toc300016" w:history="1">
         <w:r>
           <w:rPr>
             <w:rStyle w:val="Hyperlink"/>
@@ -444,7 +461,7 @@
           <w:tab w:val="right" w:leader="dot" w:pos="9016"/>
         </w:tabs>
       </w:pPr>
-      <w:hyperlink w:anchor="_Toc300016" w:history="1">
+      <w:hyperlink w:anchor="_Toc300017" w:history="1">
         <w:r>
           <w:rPr>
             <w:rStyle w:val="Hyperlink"/>
@@ -1242,7 +1259,7 @@
           <w:sz w:val="18"/>
           <w:szCs w:val="18"/>
         </w:rPr>
-        <w:t>ТЕОРІЯ 2</w:t>
+        <w:t>ТЕОРІЯ 2 · МОЖНА ПРОПУСТИТИ</w:t>
       </w:r>
     </w:p>
     <w:p>
@@ -1251,7 +1268,7 @@
       </w:pPr>
       <w:bookmarkStart w:id="104" w:name="_Toc300004"/>
       <w:r>
-        <w:t>Слайд 4 · Цикл</w:t>
+        <w:t>Слайд 4 · Подорож у пам’ять</w:t>
       </w:r>
       <w:bookmarkEnd w:id="104"/>
     </w:p>
@@ -1268,7 +1285,7 @@
         <w:spacing w:after="120" w:line="300" w:lineRule="auto"/>
       </w:pPr>
       <w:r>
-        <w:t xml:space="preserve">Справжній рівень гри «Довгий коридор»: той самий коридор (9 кроків і транзистор), але комірок лише 8. У пульті з’являється нова зелена кнопка «цикл». Учень додає «цикл», усередину кладе «вперед()», торканням змінює число «×N» (від 2 до 9), а після циклу ставить «увімкнути()».</w:t>
+        <w:t xml:space="preserve">Те саме, що «Подорож углиб» в уроці 2, але тепер про пам’ять. Чотири рівні масштабу: iPad → плата → чип пам’яті → комірки. Учень торкається підсвічених місць (на платі це два чипи праворуч), а кнопки-«крихти» вгорі дозволяють повернутись на рівень назад. На платі можна торкнутися батареї, процесора й Wi-Fi: Біт розповість про кожну деталь.</w:t>
       </w:r>
     </w:p>
     <w:p>
@@ -1276,7 +1293,7 @@
         <w:spacing w:after="120" w:line="300" w:lineRule="auto"/>
       </w:pPr>
       <w:r>
-        <w:t xml:space="preserve">Програма займає 3 комірки замість 10. Після перемоги — штамп «ЦИКЛ».</w:t>
+        <w:t xml:space="preserve">Останній рівень — п’ять байтів із «відерець». Торкання відерця вмикає або вимикає біт: відерце з водою — це 1, порожнє — 0. Праворуч видно число, яке виходить із восьми бітів, а коли це код латинської літери, ще й саму літеру. Кнопка «Напиши BIT» сама записує три байти, «Очистити» стирає. Штамп «БАЙТ» — коли в рядку вийшла літера.</w:t>
       </w:r>
     </w:p>
     <w:p>
@@ -1292,83 +1309,67 @@
         <w:pStyle w:val="Heading3"/>
       </w:pPr>
       <w:r>
-        <w:t>Що таке цикл</w:t>
+        <w:t>Де пам’ять в iPad</w:t>
       </w:r>
     </w:p>
     <w:p>
       <w:pPr>
         <w:spacing w:after="120" w:line="300" w:lineRule="auto"/>
       </w:pPr>
+      <w:r>
+        <w:t xml:space="preserve">Поруч із процесором на платі стоять чипи оперативної пам’яті. Це не те саме, що сховище, де лежать ігри й фото: там пам’ять іншого виду, яка не забуває без живлення. Для наочності на слайді чипи пам’яті намальовано поруч із процесором. У багатьох планшетах і телефонах вони насправді лежать просто над ним, як два бутерброди.</w:t>
+      </w:r>
+    </w:p>
+    <w:p>
+      <w:pPr>
+        <w:pStyle w:val="Heading3"/>
+      </w:pPr>
+      <w:r>
+        <w:t>Таблиця комірок</w:t>
+      </w:r>
+    </w:p>
+    <w:p>
+      <w:pPr>
+        <w:spacing w:after="120" w:line="300" w:lineRule="auto"/>
+      </w:pPr>
+      <w:r>
+        <w:t xml:space="preserve">Усередині чипа комірки стоять рядами й стовпчиками, як клітинки в зошиті. Кожна має свій номер (адресу), за яким її знаходить процесор. Саме тому він бере команду з потрібної комірки за лічильником команд.</w:t>
+      </w:r>
+    </w:p>
+    <w:p>
+      <w:pPr>
+        <w:pStyle w:val="Heading3"/>
+      </w:pPr>
+      <w:r>
+        <w:t>Одна комірка — один біт</w:t>
+      </w:r>
+    </w:p>
+    <w:p>
+      <w:pPr>
+        <w:spacing w:after="120" w:line="300" w:lineRule="auto"/>
+      </w:pPr>
+      <w:r>
+        <w:t xml:space="preserve">У звичайній оперативній пам’яті комірка складається з одного перемикача (транзистора) і крихітного «відерця» для електричного заряду (конденсатора). Є заряд — це </w:t>
+      </w:r>
       <w:r>
         <w:rPr>
           <w:b/>
           <w:bCs/>
         </w:rPr>
-        <w:t xml:space="preserve">Цикл</w:t>
-      </w:r>
-      <w:r>
-        <w:t xml:space="preserve"> — це команда, яка повторює інші команди задану кількість разів. У коді вона виглядає так:</w:t>
-      </w:r>
-    </w:p>
-    <w:p>
-      <w:pPr>
-        <w:keepLines/>
-        <w:shd w:val="clear" w:color="auto" w:fill="F4F7FD"/>
-        <w:spacing w:before="40" w:after="120"/>
-        <w:ind w:left="360"/>
-      </w:pPr>
-      <w:r>
-        <w:rPr>
-          <w:rFonts w:ascii="Consolas" w:hAnsi="Consolas" w:cs="Consolas"/>
-          <w:sz w:val="21"/>
-          <w:szCs w:val="21"/>
-        </w:rPr>
-        <w:t xml:space="preserve">повтори(9) { вперед() }</w:t>
-      </w:r>
-    </w:p>
-    <w:p>
-      <w:pPr>
-        <w:spacing w:after="120" w:line="300" w:lineRule="auto"/>
-      </w:pPr>
-      <w:r>
-        <w:t xml:space="preserve">Англійською: </w:t>
-      </w:r>
-      <w:r>
-        <w:rPr>
-          <w:rFonts w:ascii="Consolas" w:hAnsi="Consolas" w:cs="Consolas"/>
-          <w:sz w:val="21"/>
-          <w:szCs w:val="21"/>
-        </w:rPr>
-        <w:t xml:space="preserve">repeat(9) { forward() }</w:t>
-      </w:r>
-      <w:r>
-        <w:t xml:space="preserve"> (кнопка EN). Так цикл пишуть у справжніх мовах програмування.</w:t>
-      </w:r>
-    </w:p>
-    <w:p>
-      <w:pPr>
-        <w:pStyle w:val="Heading3"/>
-      </w:pPr>
-      <w:r>
-        <w:t>Скільки місця займає цикл</w:t>
-      </w:r>
-    </w:p>
-    <w:p>
-      <w:pPr>
-        <w:spacing w:after="120" w:line="300" w:lineRule="auto"/>
-      </w:pPr>
-      <w:r>
-        <w:t xml:space="preserve">Рамка циклу займає </w:t>
+        <w:t xml:space="preserve">1</w:t>
+      </w:r>
+      <w:r>
+        <w:t xml:space="preserve">, немає — </w:t>
       </w:r>
       <w:r>
         <w:rPr>
           <w:b/>
           <w:bCs/>
         </w:rPr>
-        <w:t xml:space="preserve">одну</w:t>
-      </w:r>
-      <w:r>
-        <w:t xml:space="preserve"> комірку, а кожна команда всередині — ще по одній. Тому «повтори(9) { вперед() } увімкнути()» — це 3 комірки.</w:t>
+        <w:t xml:space="preserve">0</w:t>
+      </w:r>
+      <w:r>
+        <w:t xml:space="preserve">. Заряд поступово витікає, тому пам’ять підзаряджають приблизно кожні 64 мілісекунди, тобто понад 15 разів за секунду. Вимкнули живлення — підзаряджати нікому, і пам’ять «забуває» все.</w:t>
       </w:r>
     </w:p>
     <w:p>
@@ -1376,7 +1377,441 @@
         <w:pStyle w:val="Heading3"/>
       </w:pPr>
       <w:r>
-        <w:t>Як складати програму з циклом</w:t>
+        <w:t>Біт, байт, літера</w:t>
+      </w:r>
+    </w:p>
+    <w:p>
+      <w:pPr>
+        <w:spacing w:after="120" w:line="300" w:lineRule="auto"/>
+      </w:pPr>
+      <w:r>
+        <w:t xml:space="preserve">Вісім бітів — це </w:t>
+      </w:r>
+      <w:r>
+        <w:rPr>
+          <w:b/>
+          <w:bCs/>
+        </w:rPr>
+        <w:t xml:space="preserve">байт</w:t>
+      </w:r>
+      <w:r>
+        <w:t xml:space="preserve">: він може набувати значень від 0 до 255. Одна латинська літера займає один байт. Наприклад, слово BIT на слайді записане так:</w:t>
+      </w:r>
+    </w:p>
+    <w:tbl>
+      <w:tblPr>
+        <w:tblW w:w="9026" w:type="dxa"/>
+        <w:tblLayout w:type="fixed"/>
+        <w:tblCellMar>
+          <w:left w:w="10" w:type="dxa"/>
+          <w:right w:w="10" w:type="dxa"/>
+        </w:tblCellMar>
+        <w:tblLook w:val="04A0" w:firstRow="1" w:lastRow="0" w:firstColumn="1" w:lastColumn="0" w:noHBand="0" w:noVBand="1"/>
+      </w:tblPr>
+      <w:tblGrid>
+        <w:gridCol w:w="2000"/>
+        <w:gridCol w:w="2000"/>
+        <w:gridCol w:w="5026"/>
+      </w:tblGrid>
+      <w:tr>
+        <w:trPr>
+          <w:tblHeader/>
+        </w:trPr>
+        <w:tc>
+          <w:tcPr>
+            <w:tcW w:w="2000" w:type="dxa"/>
+            <w:tcBorders>
+              <w:top w:val="single" w:sz="4" w:space="0" w:color="C9D5EC"/>
+              <w:left w:val="single" w:sz="4" w:space="0" w:color="C9D5EC"/>
+              <w:bottom w:val="single" w:sz="4" w:space="0" w:color="C9D5EC"/>
+              <w:right w:val="single" w:sz="4" w:space="0" w:color="C9D5EC"/>
+            </w:tcBorders>
+            <w:shd w:val="clear" w:color="auto" w:fill="FFE4C7"/>
+            <w:tcMar>
+              <w:top w:w="80" w:type="dxa"/>
+              <w:left w:w="120" w:type="dxa"/>
+              <w:bottom w:w="80" w:type="dxa"/>
+              <w:right w:w="120" w:type="dxa"/>
+            </w:tcMar>
+          </w:tcPr>
+          <w:p>
+            <w:pPr>
+              <w:spacing w:line="276" w:lineRule="auto"/>
+            </w:pPr>
+            <w:r>
+              <w:rPr>
+                <w:b/>
+                <w:bCs/>
+              </w:rPr>
+              <w:t xml:space="preserve">Літера</w:t>
+            </w:r>
+          </w:p>
+        </w:tc>
+        <w:tc>
+          <w:tcPr>
+            <w:tcW w:w="2000" w:type="dxa"/>
+            <w:tcBorders>
+              <w:top w:val="single" w:sz="4" w:space="0" w:color="C9D5EC"/>
+              <w:left w:val="single" w:sz="4" w:space="0" w:color="C9D5EC"/>
+              <w:bottom w:val="single" w:sz="4" w:space="0" w:color="C9D5EC"/>
+              <w:right w:val="single" w:sz="4" w:space="0" w:color="C9D5EC"/>
+            </w:tcBorders>
+            <w:shd w:val="clear" w:color="auto" w:fill="FFE4C7"/>
+            <w:tcMar>
+              <w:top w:w="80" w:type="dxa"/>
+              <w:left w:w="120" w:type="dxa"/>
+              <w:bottom w:w="80" w:type="dxa"/>
+              <w:right w:w="120" w:type="dxa"/>
+            </w:tcMar>
+          </w:tcPr>
+          <w:p>
+            <w:pPr>
+              <w:spacing w:line="276" w:lineRule="auto"/>
+            </w:pPr>
+            <w:r>
+              <w:rPr>
+                <w:b/>
+                <w:bCs/>
+              </w:rPr>
+              <w:t xml:space="preserve">Число</w:t>
+            </w:r>
+          </w:p>
+        </w:tc>
+        <w:tc>
+          <w:tcPr>
+            <w:tcW w:w="5026" w:type="dxa"/>
+            <w:tcBorders>
+              <w:top w:val="single" w:sz="4" w:space="0" w:color="C9D5EC"/>
+              <w:left w:val="single" w:sz="4" w:space="0" w:color="C9D5EC"/>
+              <w:bottom w:val="single" w:sz="4" w:space="0" w:color="C9D5EC"/>
+              <w:right w:val="single" w:sz="4" w:space="0" w:color="C9D5EC"/>
+            </w:tcBorders>
+            <w:shd w:val="clear" w:color="auto" w:fill="FFE4C7"/>
+            <w:tcMar>
+              <w:top w:w="80" w:type="dxa"/>
+              <w:left w:w="120" w:type="dxa"/>
+              <w:bottom w:w="80" w:type="dxa"/>
+              <w:right w:w="120" w:type="dxa"/>
+            </w:tcMar>
+          </w:tcPr>
+          <w:p>
+            <w:pPr>
+              <w:spacing w:line="276" w:lineRule="auto"/>
+            </w:pPr>
+            <w:r>
+              <w:rPr>
+                <w:b/>
+                <w:bCs/>
+              </w:rPr>
+              <w:t xml:space="preserve">Біти (байт)</w:t>
+            </w:r>
+          </w:p>
+        </w:tc>
+      </w:tr>
+      <w:tr>
+        <w:trPr>
+          <w:cantSplit/>
+        </w:trPr>
+        <w:tc>
+          <w:tcPr>
+            <w:tcW w:w="2000" w:type="dxa"/>
+            <w:tcBorders>
+              <w:top w:val="single" w:sz="4" w:space="0" w:color="C9D5EC"/>
+              <w:left w:val="single" w:sz="4" w:space="0" w:color="C9D5EC"/>
+              <w:bottom w:val="single" w:sz="4" w:space="0" w:color="C9D5EC"/>
+              <w:right w:val="single" w:sz="4" w:space="0" w:color="C9D5EC"/>
+            </w:tcBorders>
+            <w:tcMar>
+              <w:top w:w="80" w:type="dxa"/>
+              <w:left w:w="120" w:type="dxa"/>
+              <w:bottom w:w="80" w:type="dxa"/>
+              <w:right w:w="120" w:type="dxa"/>
+            </w:tcMar>
+          </w:tcPr>
+          <w:p>
+            <w:pPr>
+              <w:spacing w:line="276" w:lineRule="auto"/>
+            </w:pPr>
+            <w:r>
+              <w:t xml:space="preserve">B</w:t>
+            </w:r>
+          </w:p>
+        </w:tc>
+        <w:tc>
+          <w:tcPr>
+            <w:tcW w:w="2000" w:type="dxa"/>
+            <w:tcBorders>
+              <w:top w:val="single" w:sz="4" w:space="0" w:color="C9D5EC"/>
+              <w:left w:val="single" w:sz="4" w:space="0" w:color="C9D5EC"/>
+              <w:bottom w:val="single" w:sz="4" w:space="0" w:color="C9D5EC"/>
+              <w:right w:val="single" w:sz="4" w:space="0" w:color="C9D5EC"/>
+            </w:tcBorders>
+            <w:tcMar>
+              <w:top w:w="80" w:type="dxa"/>
+              <w:left w:w="120" w:type="dxa"/>
+              <w:bottom w:w="80" w:type="dxa"/>
+              <w:right w:w="120" w:type="dxa"/>
+            </w:tcMar>
+          </w:tcPr>
+          <w:p>
+            <w:pPr>
+              <w:spacing w:line="276" w:lineRule="auto"/>
+            </w:pPr>
+            <w:r>
+              <w:t xml:space="preserve">66</w:t>
+            </w:r>
+          </w:p>
+        </w:tc>
+        <w:tc>
+          <w:tcPr>
+            <w:tcW w:w="5026" w:type="dxa"/>
+            <w:tcBorders>
+              <w:top w:val="single" w:sz="4" w:space="0" w:color="C9D5EC"/>
+              <w:left w:val="single" w:sz="4" w:space="0" w:color="C9D5EC"/>
+              <w:bottom w:val="single" w:sz="4" w:space="0" w:color="C9D5EC"/>
+              <w:right w:val="single" w:sz="4" w:space="0" w:color="C9D5EC"/>
+            </w:tcBorders>
+            <w:tcMar>
+              <w:top w:w="80" w:type="dxa"/>
+              <w:left w:w="120" w:type="dxa"/>
+              <w:bottom w:w="80" w:type="dxa"/>
+              <w:right w:w="120" w:type="dxa"/>
+            </w:tcMar>
+          </w:tcPr>
+          <w:p>
+            <w:pPr>
+              <w:spacing w:line="276" w:lineRule="auto"/>
+            </w:pPr>
+            <w:r>
+              <w:t xml:space="preserve">01000010</w:t>
+            </w:r>
+          </w:p>
+        </w:tc>
+      </w:tr>
+      <w:tr>
+        <w:trPr>
+          <w:cantSplit/>
+        </w:trPr>
+        <w:tc>
+          <w:tcPr>
+            <w:tcW w:w="2000" w:type="dxa"/>
+            <w:tcBorders>
+              <w:top w:val="single" w:sz="4" w:space="0" w:color="C9D5EC"/>
+              <w:left w:val="single" w:sz="4" w:space="0" w:color="C9D5EC"/>
+              <w:bottom w:val="single" w:sz="4" w:space="0" w:color="C9D5EC"/>
+              <w:right w:val="single" w:sz="4" w:space="0" w:color="C9D5EC"/>
+            </w:tcBorders>
+            <w:tcMar>
+              <w:top w:w="80" w:type="dxa"/>
+              <w:left w:w="120" w:type="dxa"/>
+              <w:bottom w:w="80" w:type="dxa"/>
+              <w:right w:w="120" w:type="dxa"/>
+            </w:tcMar>
+          </w:tcPr>
+          <w:p>
+            <w:pPr>
+              <w:spacing w:line="276" w:lineRule="auto"/>
+            </w:pPr>
+            <w:r>
+              <w:t xml:space="preserve">I</w:t>
+            </w:r>
+          </w:p>
+        </w:tc>
+        <w:tc>
+          <w:tcPr>
+            <w:tcW w:w="2000" w:type="dxa"/>
+            <w:tcBorders>
+              <w:top w:val="single" w:sz="4" w:space="0" w:color="C9D5EC"/>
+              <w:left w:val="single" w:sz="4" w:space="0" w:color="C9D5EC"/>
+              <w:bottom w:val="single" w:sz="4" w:space="0" w:color="C9D5EC"/>
+              <w:right w:val="single" w:sz="4" w:space="0" w:color="C9D5EC"/>
+            </w:tcBorders>
+            <w:tcMar>
+              <w:top w:w="80" w:type="dxa"/>
+              <w:left w:w="120" w:type="dxa"/>
+              <w:bottom w:w="80" w:type="dxa"/>
+              <w:right w:w="120" w:type="dxa"/>
+            </w:tcMar>
+          </w:tcPr>
+          <w:p>
+            <w:pPr>
+              <w:spacing w:line="276" w:lineRule="auto"/>
+            </w:pPr>
+            <w:r>
+              <w:t xml:space="preserve">73</w:t>
+            </w:r>
+          </w:p>
+        </w:tc>
+        <w:tc>
+          <w:tcPr>
+            <w:tcW w:w="5026" w:type="dxa"/>
+            <w:tcBorders>
+              <w:top w:val="single" w:sz="4" w:space="0" w:color="C9D5EC"/>
+              <w:left w:val="single" w:sz="4" w:space="0" w:color="C9D5EC"/>
+              <w:bottom w:val="single" w:sz="4" w:space="0" w:color="C9D5EC"/>
+              <w:right w:val="single" w:sz="4" w:space="0" w:color="C9D5EC"/>
+            </w:tcBorders>
+            <w:tcMar>
+              <w:top w:w="80" w:type="dxa"/>
+              <w:left w:w="120" w:type="dxa"/>
+              <w:bottom w:w="80" w:type="dxa"/>
+              <w:right w:w="120" w:type="dxa"/>
+            </w:tcMar>
+          </w:tcPr>
+          <w:p>
+            <w:pPr>
+              <w:spacing w:line="276" w:lineRule="auto"/>
+            </w:pPr>
+            <w:r>
+              <w:t xml:space="preserve">01001001</w:t>
+            </w:r>
+          </w:p>
+        </w:tc>
+      </w:tr>
+      <w:tr>
+        <w:trPr>
+          <w:cantSplit/>
+        </w:trPr>
+        <w:tc>
+          <w:tcPr>
+            <w:tcW w:w="2000" w:type="dxa"/>
+            <w:tcBorders>
+              <w:top w:val="single" w:sz="4" w:space="0" w:color="C9D5EC"/>
+              <w:left w:val="single" w:sz="4" w:space="0" w:color="C9D5EC"/>
+              <w:bottom w:val="single" w:sz="4" w:space="0" w:color="C9D5EC"/>
+              <w:right w:val="single" w:sz="4" w:space="0" w:color="C9D5EC"/>
+            </w:tcBorders>
+            <w:tcMar>
+              <w:top w:w="80" w:type="dxa"/>
+              <w:left w:w="120" w:type="dxa"/>
+              <w:bottom w:w="80" w:type="dxa"/>
+              <w:right w:w="120" w:type="dxa"/>
+            </w:tcMar>
+          </w:tcPr>
+          <w:p>
+            <w:pPr>
+              <w:spacing w:line="276" w:lineRule="auto"/>
+            </w:pPr>
+            <w:r>
+              <w:t xml:space="preserve">T</w:t>
+            </w:r>
+          </w:p>
+        </w:tc>
+        <w:tc>
+          <w:tcPr>
+            <w:tcW w:w="2000" w:type="dxa"/>
+            <w:tcBorders>
+              <w:top w:val="single" w:sz="4" w:space="0" w:color="C9D5EC"/>
+              <w:left w:val="single" w:sz="4" w:space="0" w:color="C9D5EC"/>
+              <w:bottom w:val="single" w:sz="4" w:space="0" w:color="C9D5EC"/>
+              <w:right w:val="single" w:sz="4" w:space="0" w:color="C9D5EC"/>
+            </w:tcBorders>
+            <w:tcMar>
+              <w:top w:w="80" w:type="dxa"/>
+              <w:left w:w="120" w:type="dxa"/>
+              <w:bottom w:w="80" w:type="dxa"/>
+              <w:right w:w="120" w:type="dxa"/>
+            </w:tcMar>
+          </w:tcPr>
+          <w:p>
+            <w:pPr>
+              <w:spacing w:line="276" w:lineRule="auto"/>
+            </w:pPr>
+            <w:r>
+              <w:t xml:space="preserve">84</w:t>
+            </w:r>
+          </w:p>
+        </w:tc>
+        <w:tc>
+          <w:tcPr>
+            <w:tcW w:w="5026" w:type="dxa"/>
+            <w:tcBorders>
+              <w:top w:val="single" w:sz="4" w:space="0" w:color="C9D5EC"/>
+              <w:left w:val="single" w:sz="4" w:space="0" w:color="C9D5EC"/>
+              <w:bottom w:val="single" w:sz="4" w:space="0" w:color="C9D5EC"/>
+              <w:right w:val="single" w:sz="4" w:space="0" w:color="C9D5EC"/>
+            </w:tcBorders>
+            <w:tcMar>
+              <w:top w:w="80" w:type="dxa"/>
+              <w:left w:w="120" w:type="dxa"/>
+              <w:bottom w:w="80" w:type="dxa"/>
+              <w:right w:w="120" w:type="dxa"/>
+            </w:tcMar>
+          </w:tcPr>
+          <w:p>
+            <w:pPr>
+              <w:spacing w:line="276" w:lineRule="auto"/>
+            </w:pPr>
+            <w:r>
+              <w:t xml:space="preserve">01010100</w:t>
+            </w:r>
+          </w:p>
+        </w:tc>
+      </w:tr>
+    </w:tbl>
+    <w:p/>
+    <w:p>
+      <w:pPr>
+        <w:spacing w:after="120" w:line="300" w:lineRule="auto"/>
+      </w:pPr>
+      <w:r>
+        <w:t xml:space="preserve">Українські літери займають два байти. Тому слово з українських літер займає в пам’яті вдвічі більше місця, ніж із латинських.</w:t>
+      </w:r>
+    </w:p>
+    <w:p>
+      <w:pPr>
+        <w:pStyle w:val="Heading3"/>
+      </w:pPr>
+      <w:r>
+        <w:t>Скільки там комірок</w:t>
+      </w:r>
+    </w:p>
+    <w:p>
+      <w:pPr>
+        <w:spacing w:after="120" w:line="300" w:lineRule="auto"/>
+      </w:pPr>
+      <w:r>
+        <w:t xml:space="preserve">В iPad кілька гігабайтів оперативної пам’яті. Один гігабайт — це приблизно вісім мільярдів бітів, тобто стільки ж «відерець». Тож слайд показує лише крихітний шматочок таблиці.</w:t>
+      </w:r>
+    </w:p>
+    <w:p>
+      <w:pPr>
+        <w:pStyle w:val="Heading3"/>
+      </w:pPr>
+      <w:r>
+        <w:t>Зв’язок з уроком</w:t>
+      </w:r>
+    </w:p>
+    <w:p>
+      <w:pPr>
+        <w:spacing w:after="120" w:line="300" w:lineRule="auto"/>
+      </w:pPr>
+      <w:r>
+        <w:t xml:space="preserve">На слайді «Пам’ять тісна» одна комірка тримала цілу команду (3 біти). У справжній пам’яті одна комірка тримає один біт, а команда або літера займають кілька комірок поспіль. Ідея та сама: пам’ять обмежена, тому програму варто писати коротко.</w:t>
+      </w:r>
+    </w:p>
+    <w:p>
+      <w:pPr>
+        <w:pStyle w:val="Heading3"/>
+      </w:pPr>
+      <w:r>
+        <w:t>Пам’ять колись</w:t>
+      </w:r>
+    </w:p>
+    <w:p>
+      <w:pPr>
+        <w:spacing w:after="120" w:line="300" w:lineRule="auto"/>
+      </w:pPr>
+      <w:r>
+        <w:t xml:space="preserve">Перші комп’ютери зберігали кожен біт у крихітному намагніченому кільці з дроту. Такі кільця нанизували на сітку з дротів, здебільшого вручну. Один мегабайт тоді коштував би цілого будинку.</w:t>
+      </w:r>
+    </w:p>
+    <w:p>
+      <w:pPr>
+        <w:pStyle w:val="Heading2"/>
+      </w:pPr>
+      <w:r>
+        <w:t>Як пояснити учню</w:t>
       </w:r>
     </w:p>
     <w:p>
@@ -1389,7 +1824,7 @@
         <w:spacing w:after="80" w:line="290" w:lineRule="auto"/>
       </w:pPr>
       <w:r>
-        <w:t xml:space="preserve">Натисни «цикл»: з’явиться рамка «×2». Блимає «+»: саме туди потраплять наступні команди.</w:t>
+        <w:t xml:space="preserve">Нехай учень сам знайде пам’ять на платі: підказка — «два однакові чипи з рисочками».</w:t>
       </w:r>
     </w:p>
     <w:p>
@@ -1402,7 +1837,7 @@
         <w:spacing w:after="80" w:line="290" w:lineRule="auto"/>
       </w:pPr>
       <w:r>
-        <w:t xml:space="preserve">Додай команди всередину рамки.</w:t>
+        <w:t xml:space="preserve">На останньому рівні спершу дайте вільно потикати у відерця. Потім попросіть записати літеру B (біти 01000010).</w:t>
       </w:r>
     </w:p>
     <w:p>
@@ -1415,114 +1850,37 @@
         <w:spacing w:after="80" w:line="290" w:lineRule="auto"/>
       </w:pPr>
       <w:r>
-        <w:t xml:space="preserve">Торкнись числа «×», щоб змінити кількість повторів: 2 → 3 → … → 9 → 2.</w:t>
-      </w:r>
-    </w:p>
-    <w:p>
-      <w:pPr>
-        <w:pStyle w:val="ListParagraph"/>
-        <w:numPr>
-          <w:ilvl w:val="0"/>
-          <w:numId w:val="2"/>
-        </w:numPr>
-        <w:spacing w:after="80" w:line="290" w:lineRule="auto"/>
-      </w:pPr>
-      <w:r>
-        <w:t xml:space="preserve">Щоб додати команду </w:t>
-      </w:r>
+        <w:t xml:space="preserve">Наприкінці покажіть кнопку «Напиши BIT»: це місток до слова «біт», з якого починається курс.</w:t>
+      </w:r>
+    </w:p>
+    <w:p>
+      <w:pPr>
+        <w:pStyle w:val="Heading2"/>
+      </w:pPr>
+      <w:r>
+        <w:t>Можливі питання учня</w:t>
+      </w:r>
+    </w:p>
+    <w:p>
+      <w:pPr>
+        <w:keepNext/>
+        <w:spacing w:before="80" w:after="40"/>
+      </w:pPr>
       <w:r>
         <w:rPr>
           <w:b/>
           <w:bCs/>
         </w:rPr>
-        <w:t xml:space="preserve">після</w:t>
-      </w:r>
-      <w:r>
-        <w:t xml:space="preserve"> циклу, торкнись пунктирної смужки під усіма командами.</w:t>
-      </w:r>
-    </w:p>
-    <w:p>
-      <w:pPr>
-        <w:pStyle w:val="ListParagraph"/>
-        <w:numPr>
-          <w:ilvl w:val="0"/>
-          <w:numId w:val="2"/>
-        </w:numPr>
-        <w:spacing w:after="80" w:line="290" w:lineRule="auto"/>
-      </w:pPr>
-      <w:r>
-        <w:t xml:space="preserve">Торкнись команди, щоб прибрати її, або «✕» на рамці, щоб прибрати весь цикл.</w:t>
-      </w:r>
-    </w:p>
-    <w:p>
-      <w:pPr>
-        <w:pStyle w:val="Heading3"/>
-      </w:pPr>
-      <w:r>
-        <w:t>Чому повторів від 2 до 9</w:t>
+        <w:t xml:space="preserve">— Чому відерця, а не лампочки?</w:t>
       </w:r>
     </w:p>
     <w:p>
       <w:pPr>
         <w:spacing w:after="120" w:line="300" w:lineRule="auto"/>
-      </w:pPr>
-      <w:r>
-        <w:t xml:space="preserve">Один повтор — це просто команда, тож цикл починається з двох. Дев’ять — межа нашої гри. Для ще більшого числа повторів цикл кладуть у цикл: так, як у третьому наборі рівнів.</w:t>
-      </w:r>
-    </w:p>
-    <w:p>
-      <w:pPr>
-        <w:pStyle w:val="Heading2"/>
-      </w:pPr>
-      <w:r>
-        <w:t>Як пояснити учню</w:t>
-      </w:r>
-    </w:p>
-    <w:p>
-      <w:pPr>
-        <w:pStyle w:val="ListParagraph"/>
-        <w:numPr>
-          <w:ilvl w:val="0"/>
-          <w:numId w:val="2"/>
-        </w:numPr>
-        <w:spacing w:after="80" w:line="290" w:lineRule="auto"/>
-      </w:pPr>
-      <w:r>
-        <w:t xml:space="preserve">Нехай учень спершу спробує без циклу: програма не вміститься, і кнопка «цикл» стане природною підказкою.</w:t>
-      </w:r>
-    </w:p>
-    <w:p>
-      <w:pPr>
-        <w:pStyle w:val="ListParagraph"/>
-        <w:numPr>
-          <w:ilvl w:val="0"/>
-          <w:numId w:val="2"/>
-        </w:numPr>
-        <w:spacing w:after="80" w:line="290" w:lineRule="auto"/>
-      </w:pPr>
-      <w:r>
-        <w:t xml:space="preserve">Типова помилка: команда опинилась поза рамкою. Покажіть блимаюче «+»: воно вказує, куди потрапить команда.</w:t>
-      </w:r>
-    </w:p>
-    <w:p>
-      <w:pPr>
-        <w:pStyle w:val="ListParagraph"/>
-        <w:numPr>
-          <w:ilvl w:val="0"/>
-          <w:numId w:val="2"/>
-        </w:numPr>
-        <w:spacing w:after="80" w:line="290" w:lineRule="auto"/>
-      </w:pPr>
-      <w:r>
-        <w:t xml:space="preserve">Типова помилка: «×N» на одиницю більше чи менше. Підкажіть порахувати кроки до транзистора.</w:t>
-      </w:r>
-    </w:p>
-    <w:p>
-      <w:pPr>
-        <w:pStyle w:val="Heading2"/>
-      </w:pPr>
-      <w:r>
-        <w:t>Можливі питання учня</w:t>
+        <w:ind w:left="360"/>
+      </w:pPr>
+      <w:r>
+        <w:t xml:space="preserve">У справжній пам’яті біт — це електричний заряд: є заряд — 1, немає — 0. Відерце з водою — наочна картинка заряду. Лампочки були на слайді про транзистори в процесорі.</w:t>
       </w:r>
     </w:p>
     <w:p>
@@ -1535,7 +1893,7 @@
           <w:b/>
           <w:bCs/>
         </w:rPr>
-        <w:t xml:space="preserve">— Чому «вперед()» виконується багато разів, а «увімкнути()» один?</w:t>
+        <w:t xml:space="preserve">— Чому пам’ять «забуває» при вимкненні?</w:t>
       </w:r>
     </w:p>
     <w:p>
@@ -1544,7 +1902,7 @@
         <w:ind w:left="360"/>
       </w:pPr>
       <w:r>
-        <w:t xml:space="preserve">Бо «увімкнути()» стоїть після рамки. Усе, що всередині, повторюється, усе, що поза рамкою, виконується один раз.</w:t>
+        <w:t xml:space="preserve">Заряд у комірках витікає, а без живлення його нікому підзаряджати.</w:t>
       </w:r>
     </w:p>
     <w:p>
@@ -1557,7 +1915,7 @@
           <w:b/>
           <w:bCs/>
         </w:rPr>
-        <w:t xml:space="preserve">— Що буде з порожнім циклом?</w:t>
+        <w:t xml:space="preserve">— А як тоді зберігаються фото?</w:t>
       </w:r>
     </w:p>
     <w:p>
@@ -1566,7 +1924,7 @@
         <w:ind w:left="360"/>
       </w:pPr>
       <w:r>
-        <w:t xml:space="preserve">Нічого: Біт скаже «У циклі нічого повторювати». Але порожня рамка однаково займає комірку.</w:t>
+        <w:t xml:space="preserve">Для цього є сховище: пам’ять іншого виду, яка тримає біти й без живлення.</w:t>
       </w:r>
     </w:p>
     <w:p>
@@ -1593,7 +1951,7 @@
         <w:t xml:space="preserve">ЗАПАМ’ЯТАЙ   </w:t>
       </w:r>
       <w:r>
-        <w:t xml:space="preserve">Цикл повторює команди, що стоять усередині його рамки. Він займає одну комірку, а повторів може бути багато.</w:t>
+        <w:t xml:space="preserve">Пам’ять складається з мільярдів комірок. Кожна тримає один біт: 0 або 1. Вісім бітів — це байт.</w:t>
       </w:r>
     </w:p>
     <w:p>
@@ -1621,9 +1979,379 @@
       </w:pPr>
       <w:bookmarkStart w:id="105" w:name="_Toc300005"/>
       <w:r>
-        <w:t>Слайд 5 · Мільярд кроків</w:t>
+        <w:t>Слайд 5 · Цикл</w:t>
       </w:r>
       <w:bookmarkEnd w:id="105"/>
+    </w:p>
+    <w:p>
+      <w:pPr>
+        <w:pStyle w:val="Heading2"/>
+      </w:pPr>
+      <w:r>
+        <w:t>Що на слайді</w:t>
+      </w:r>
+    </w:p>
+    <w:p>
+      <w:pPr>
+        <w:spacing w:after="120" w:line="300" w:lineRule="auto"/>
+      </w:pPr>
+      <w:r>
+        <w:t xml:space="preserve">Справжній рівень гри «Довгий коридор»: той самий коридор (9 кроків і транзистор), але комірок лише 8. У пульті з’являється нова зелена кнопка «цикл». Учень додає «цикл», усередину кладе «вперед()», торканням змінює число «×N» (від 2 до 9), а після циклу ставить «увімкнути()».</w:t>
+      </w:r>
+    </w:p>
+    <w:p>
+      <w:pPr>
+        <w:spacing w:after="120" w:line="300" w:lineRule="auto"/>
+      </w:pPr>
+      <w:r>
+        <w:t xml:space="preserve">Програма займає 3 комірки замість 10. Після перемоги — штамп «ЦИКЛ».</w:t>
+      </w:r>
+    </w:p>
+    <w:p>
+      <w:pPr>
+        <w:pStyle w:val="Heading2"/>
+      </w:pPr>
+      <w:r>
+        <w:t>Теорія простими словами</w:t>
+      </w:r>
+    </w:p>
+    <w:p>
+      <w:pPr>
+        <w:pStyle w:val="Heading3"/>
+      </w:pPr>
+      <w:r>
+        <w:t>Що таке цикл</w:t>
+      </w:r>
+    </w:p>
+    <w:p>
+      <w:pPr>
+        <w:spacing w:after="120" w:line="300" w:lineRule="auto"/>
+      </w:pPr>
+      <w:r>
+        <w:rPr>
+          <w:b/>
+          <w:bCs/>
+        </w:rPr>
+        <w:t xml:space="preserve">Цикл</w:t>
+      </w:r>
+      <w:r>
+        <w:t xml:space="preserve"> — це команда, яка повторює інші команди задану кількість разів. У коді вона виглядає так:</w:t>
+      </w:r>
+    </w:p>
+    <w:p>
+      <w:pPr>
+        <w:keepLines/>
+        <w:shd w:val="clear" w:color="auto" w:fill="F4F7FD"/>
+        <w:spacing w:before="40" w:after="120"/>
+        <w:ind w:left="360"/>
+      </w:pPr>
+      <w:r>
+        <w:rPr>
+          <w:rFonts w:ascii="Consolas" w:hAnsi="Consolas" w:cs="Consolas"/>
+          <w:sz w:val="21"/>
+          <w:szCs w:val="21"/>
+        </w:rPr>
+        <w:t xml:space="preserve">повтори(9) { вперед() }</w:t>
+      </w:r>
+    </w:p>
+    <w:p>
+      <w:pPr>
+        <w:spacing w:after="120" w:line="300" w:lineRule="auto"/>
+      </w:pPr>
+      <w:r>
+        <w:t xml:space="preserve">Англійською: </w:t>
+      </w:r>
+      <w:r>
+        <w:rPr>
+          <w:rFonts w:ascii="Consolas" w:hAnsi="Consolas" w:cs="Consolas"/>
+          <w:sz w:val="21"/>
+          <w:szCs w:val="21"/>
+        </w:rPr>
+        <w:t xml:space="preserve">repeat(9) { forward() }</w:t>
+      </w:r>
+      <w:r>
+        <w:t xml:space="preserve"> (кнопка EN). Так цикл пишуть у справжніх мовах програмування.</w:t>
+      </w:r>
+    </w:p>
+    <w:p>
+      <w:pPr>
+        <w:pStyle w:val="Heading3"/>
+      </w:pPr>
+      <w:r>
+        <w:t>Скільки місця займає цикл</w:t>
+      </w:r>
+    </w:p>
+    <w:p>
+      <w:pPr>
+        <w:spacing w:after="120" w:line="300" w:lineRule="auto"/>
+      </w:pPr>
+      <w:r>
+        <w:t xml:space="preserve">Рамка циклу займає </w:t>
+      </w:r>
+      <w:r>
+        <w:rPr>
+          <w:b/>
+          <w:bCs/>
+        </w:rPr>
+        <w:t xml:space="preserve">одну</w:t>
+      </w:r>
+      <w:r>
+        <w:t xml:space="preserve"> комірку, а кожна команда всередині — ще по одній. Тому «повтори(9) { вперед() } увімкнути()» — це 3 комірки.</w:t>
+      </w:r>
+    </w:p>
+    <w:p>
+      <w:pPr>
+        <w:pStyle w:val="Heading3"/>
+      </w:pPr>
+      <w:r>
+        <w:t>Як складати програму з циклом</w:t>
+      </w:r>
+    </w:p>
+    <w:p>
+      <w:pPr>
+        <w:pStyle w:val="ListParagraph"/>
+        <w:numPr>
+          <w:ilvl w:val="0"/>
+          <w:numId w:val="2"/>
+        </w:numPr>
+        <w:spacing w:after="80" w:line="290" w:lineRule="auto"/>
+      </w:pPr>
+      <w:r>
+        <w:t xml:space="preserve">Натисни «цикл»: з’явиться рамка «×2». Блимає «+»: саме туди потраплять наступні команди.</w:t>
+      </w:r>
+    </w:p>
+    <w:p>
+      <w:pPr>
+        <w:pStyle w:val="ListParagraph"/>
+        <w:numPr>
+          <w:ilvl w:val="0"/>
+          <w:numId w:val="2"/>
+        </w:numPr>
+        <w:spacing w:after="80" w:line="290" w:lineRule="auto"/>
+      </w:pPr>
+      <w:r>
+        <w:t xml:space="preserve">Додай команди всередину рамки.</w:t>
+      </w:r>
+    </w:p>
+    <w:p>
+      <w:pPr>
+        <w:pStyle w:val="ListParagraph"/>
+        <w:numPr>
+          <w:ilvl w:val="0"/>
+          <w:numId w:val="2"/>
+        </w:numPr>
+        <w:spacing w:after="80" w:line="290" w:lineRule="auto"/>
+      </w:pPr>
+      <w:r>
+        <w:t xml:space="preserve">Торкнись числа «×», щоб змінити кількість повторів: 2 → 3 → … → 9 → 2.</w:t>
+      </w:r>
+    </w:p>
+    <w:p>
+      <w:pPr>
+        <w:pStyle w:val="ListParagraph"/>
+        <w:numPr>
+          <w:ilvl w:val="0"/>
+          <w:numId w:val="2"/>
+        </w:numPr>
+        <w:spacing w:after="80" w:line="290" w:lineRule="auto"/>
+      </w:pPr>
+      <w:r>
+        <w:t xml:space="preserve">Щоб додати команду </w:t>
+      </w:r>
+      <w:r>
+        <w:rPr>
+          <w:b/>
+          <w:bCs/>
+        </w:rPr>
+        <w:t xml:space="preserve">після</w:t>
+      </w:r>
+      <w:r>
+        <w:t xml:space="preserve"> циклу, торкнись пунктирної смужки під усіма командами.</w:t>
+      </w:r>
+    </w:p>
+    <w:p>
+      <w:pPr>
+        <w:pStyle w:val="ListParagraph"/>
+        <w:numPr>
+          <w:ilvl w:val="0"/>
+          <w:numId w:val="2"/>
+        </w:numPr>
+        <w:spacing w:after="80" w:line="290" w:lineRule="auto"/>
+      </w:pPr>
+      <w:r>
+        <w:t xml:space="preserve">Торкнись команди, щоб прибрати її, або «✕» на рамці, щоб прибрати весь цикл.</w:t>
+      </w:r>
+    </w:p>
+    <w:p>
+      <w:pPr>
+        <w:pStyle w:val="Heading3"/>
+      </w:pPr>
+      <w:r>
+        <w:t>Чому повторів від 2 до 9</w:t>
+      </w:r>
+    </w:p>
+    <w:p>
+      <w:pPr>
+        <w:spacing w:after="120" w:line="300" w:lineRule="auto"/>
+      </w:pPr>
+      <w:r>
+        <w:t xml:space="preserve">Один повтор — це просто команда, тож цикл починається з двох. Дев’ять — межа нашої гри. Для ще більшого числа повторів цикл кладуть у цикл: так, як у третьому наборі рівнів.</w:t>
+      </w:r>
+    </w:p>
+    <w:p>
+      <w:pPr>
+        <w:pStyle w:val="Heading2"/>
+      </w:pPr>
+      <w:r>
+        <w:t>Як пояснити учню</w:t>
+      </w:r>
+    </w:p>
+    <w:p>
+      <w:pPr>
+        <w:pStyle w:val="ListParagraph"/>
+        <w:numPr>
+          <w:ilvl w:val="0"/>
+          <w:numId w:val="2"/>
+        </w:numPr>
+        <w:spacing w:after="80" w:line="290" w:lineRule="auto"/>
+      </w:pPr>
+      <w:r>
+        <w:t xml:space="preserve">Нехай учень спершу спробує без циклу: програма не вміститься, і кнопка «цикл» стане природною підказкою.</w:t>
+      </w:r>
+    </w:p>
+    <w:p>
+      <w:pPr>
+        <w:pStyle w:val="ListParagraph"/>
+        <w:numPr>
+          <w:ilvl w:val="0"/>
+          <w:numId w:val="2"/>
+        </w:numPr>
+        <w:spacing w:after="80" w:line="290" w:lineRule="auto"/>
+      </w:pPr>
+      <w:r>
+        <w:t xml:space="preserve">Типова помилка: команда опинилась поза рамкою. Покажіть блимаюче «+»: воно вказує, куди потрапить команда.</w:t>
+      </w:r>
+    </w:p>
+    <w:p>
+      <w:pPr>
+        <w:pStyle w:val="ListParagraph"/>
+        <w:numPr>
+          <w:ilvl w:val="0"/>
+          <w:numId w:val="2"/>
+        </w:numPr>
+        <w:spacing w:after="80" w:line="290" w:lineRule="auto"/>
+      </w:pPr>
+      <w:r>
+        <w:t xml:space="preserve">Типова помилка: «×N» на одиницю більше чи менше. Підкажіть порахувати кроки до транзистора.</w:t>
+      </w:r>
+    </w:p>
+    <w:p>
+      <w:pPr>
+        <w:pStyle w:val="Heading2"/>
+      </w:pPr>
+      <w:r>
+        <w:t>Можливі питання учня</w:t>
+      </w:r>
+    </w:p>
+    <w:p>
+      <w:pPr>
+        <w:keepNext/>
+        <w:spacing w:before="80" w:after="40"/>
+      </w:pPr>
+      <w:r>
+        <w:rPr>
+          <w:b/>
+          <w:bCs/>
+        </w:rPr>
+        <w:t xml:space="preserve">— Чому «вперед()» виконується багато разів, а «увімкнути()» один?</w:t>
+      </w:r>
+    </w:p>
+    <w:p>
+      <w:pPr>
+        <w:spacing w:after="120" w:line="300" w:lineRule="auto"/>
+        <w:ind w:left="360"/>
+      </w:pPr>
+      <w:r>
+        <w:t xml:space="preserve">Бо «увімкнути()» стоїть після рамки. Усе, що всередині, повторюється, усе, що поза рамкою, виконується один раз.</w:t>
+      </w:r>
+    </w:p>
+    <w:p>
+      <w:pPr>
+        <w:keepNext/>
+        <w:spacing w:before="80" w:after="40"/>
+      </w:pPr>
+      <w:r>
+        <w:rPr>
+          <w:b/>
+          <w:bCs/>
+        </w:rPr>
+        <w:t xml:space="preserve">— Що буде з порожнім циклом?</w:t>
+      </w:r>
+    </w:p>
+    <w:p>
+      <w:pPr>
+        <w:spacing w:after="120" w:line="300" w:lineRule="auto"/>
+        <w:ind w:left="360"/>
+      </w:pPr>
+      <w:r>
+        <w:t xml:space="preserve">Нічого: Біт скаже «У циклі нічого повторювати». Але порожня рамка однаково займає комірку.</w:t>
+      </w:r>
+    </w:p>
+    <w:p>
+      <w:pPr>
+        <w:keepLines/>
+        <w:pBdr>
+          <w:top w:val="single" w:sz="6" w:space="6" w:color="16193A"/>
+          <w:left w:val="single" w:sz="6" w:space="8" w:color="16193A"/>
+          <w:bottom w:val="single" w:sz="6" w:space="6" w:color="16193A"/>
+          <w:right w:val="single" w:sz="6" w:space="8" w:color="16193A"/>
+        </w:pBdr>
+        <w:shd w:val="clear" w:color="auto" w:fill="E9F0FB"/>
+        <w:spacing w:before="160" w:after="200" w:line="300" w:lineRule="auto"/>
+        <w:ind w:left="160" w:right="160"/>
+      </w:pPr>
+      <w:r>
+        <w:rPr>
+          <w:b/>
+          <w:bCs/>
+          <w:color w:val="E2632A"/>
+          <w:sz w:val="18"/>
+          <w:szCs w:val="18"/>
+        </w:rPr>
+        <w:t xml:space="preserve">ЗАПАМ’ЯТАЙ   </w:t>
+      </w:r>
+      <w:r>
+        <w:t xml:space="preserve">Цикл повторює команди, що стоять усередині його рамки. Він займає одну комірку, а повторів може бути багато.</w:t>
+      </w:r>
+    </w:p>
+    <w:p>
+      <w:pPr>
+        <w:keepNext/>
+        <w:pBdr>
+          <w:top w:val="single" w:sz="12" w:space="14" w:color="16193A"/>
+        </w:pBdr>
+        <w:spacing w:before="560" w:after="40"/>
+      </w:pPr>
+      <w:r>
+        <w:rPr>
+          <w:b/>
+          <w:bCs/>
+          <w:color w:val="E2632A"/>
+          <w:sz w:val="18"/>
+          <w:szCs w:val="18"/>
+        </w:rPr>
+        <w:t>ТЕОРІЯ 4</w:t>
+      </w:r>
+    </w:p>
+    <w:p>
+      <w:pPr>
+        <w:pStyle w:val="Heading1"/>
+      </w:pPr>
+      <w:bookmarkStart w:id="106" w:name="_Toc300006"/>
+      <w:r>
+        <w:t>Слайд 6 · Мільярд кроків</w:t>
+      </w:r>
+      <w:bookmarkEnd w:id="106"/>
     </w:p>
     <w:p>
       <w:pPr>
@@ -2482,18 +3210,18 @@
           <w:sz w:val="18"/>
           <w:szCs w:val="18"/>
         </w:rPr>
-        <w:t>ТЕОРІЯ 4</w:t>
+        <w:t>ТЕОРІЯ 5</w:t>
       </w:r>
     </w:p>
     <w:p>
       <w:pPr>
         <w:pStyle w:val="Heading1"/>
       </w:pPr>
-      <w:bookmarkStart w:id="106" w:name="_Toc300006"/>
-      <w:r>
-        <w:t>Слайд 6 · Як процесор повторює</w:t>
-      </w:r>
-      <w:bookmarkEnd w:id="106"/>
+      <w:bookmarkStart w:id="107" w:name="_Toc300007"/>
+      <w:r>
+        <w:t>Слайд 7 · Як процесор повторює</w:t>
+      </w:r>
+      <w:bookmarkEnd w:id="107"/>
     </w:p>
     <w:p>
       <w:pPr>
@@ -3668,18 +4396,18 @@
           <w:sz w:val="18"/>
           <w:szCs w:val="18"/>
         </w:rPr>
-        <w:t>ТЕОРІЯ 5</w:t>
+        <w:t>ТЕОРІЯ 6</w:t>
       </w:r>
     </w:p>
     <w:p>
       <w:pPr>
         <w:pStyle w:val="Heading1"/>
       </w:pPr>
-      <w:bookmarkStart w:id="107" w:name="_Toc300007"/>
-      <w:r>
-        <w:t>Слайд 7 · iPad крутиться в циклі</w:t>
-      </w:r>
-      <w:bookmarkEnd w:id="107"/>
+      <w:bookmarkStart w:id="108" w:name="_Toc300008"/>
+      <w:r>
+        <w:t>Слайд 8 · iPad крутиться в циклі</w:t>
+      </w:r>
+      <w:bookmarkEnd w:id="108"/>
     </w:p>
     <w:p>
       <w:pPr>
@@ -3919,18 +4647,18 @@
           <w:sz w:val="18"/>
           <w:szCs w:val="18"/>
         </w:rPr>
-        <w:t>ТЕОРІЯ 6 · МОЖНА ПРОПУСТИТИ</w:t>
+        <w:t>ТЕОРІЯ 7 · МОЖНА ПРОПУСТИТИ</w:t>
       </w:r>
     </w:p>
     <w:p>
       <w:pPr>
         <w:pStyle w:val="Heading1"/>
       </w:pPr>
-      <w:bookmarkStart w:id="108" w:name="_Toc300008"/>
-      <w:r>
-        <w:t>Слайд 8 · Перевір себе</w:t>
-      </w:r>
-      <w:bookmarkEnd w:id="108"/>
+      <w:bookmarkStart w:id="109" w:name="_Toc300009"/>
+      <w:r>
+        <w:t>Слайд 9 · Перевір себе</w:t>
+      </w:r>
+      <w:bookmarkEnd w:id="109"/>
     </w:p>
     <w:p>
       <w:pPr>
@@ -4478,11 +5206,11 @@
       <w:pPr>
         <w:pStyle w:val="Heading1"/>
       </w:pPr>
-      <w:bookmarkStart w:id="109" w:name="_Toc300009"/>
-      <w:r>
-        <w:t>Слайд 9 · Гра: Коридори (рівні 1–3)</w:t>
-      </w:r>
-      <w:bookmarkEnd w:id="109"/>
+      <w:bookmarkStart w:id="110" w:name="_Toc300010"/>
+      <w:r>
+        <w:t>Слайд 10 · Гра: Коридори (рівні 1–3)</w:t>
+      </w:r>
+      <w:bookmarkEnd w:id="110"/>
     </w:p>
     <w:p>
       <w:pPr>
@@ -4846,11 +5574,11 @@
       <w:pPr>
         <w:pStyle w:val="Heading1"/>
       </w:pPr>
-      <w:bookmarkStart w:id="110" w:name="_Toc300010"/>
-      <w:r>
-        <w:t>Слайд 10 · Гра: Візерунки (рівні 4–6)</w:t>
-      </w:r>
-      <w:bookmarkEnd w:id="110"/>
+      <w:bookmarkStart w:id="111" w:name="_Toc300011"/>
+      <w:r>
+        <w:t>Слайд 11 · Гра: Візерунки (рівні 4–6)</w:t>
+      </w:r>
+      <w:bookmarkEnd w:id="111"/>
     </w:p>
     <w:p>
       <w:pPr>
@@ -5132,11 +5860,11 @@
       <w:pPr>
         <w:pStyle w:val="Heading1"/>
       </w:pPr>
-      <w:bookmarkStart w:id="111" w:name="_Toc300011"/>
-      <w:r>
-        <w:t>Слайд 11 · Гра: Цикл у циклі (рівні 7–9)</w:t>
-      </w:r>
-      <w:bookmarkEnd w:id="111"/>
+      <w:bookmarkStart w:id="112" w:name="_Toc300012"/>
+      <w:r>
+        <w:t>Слайд 12 · Гра: Цикл у циклі (рівні 7–9)</w:t>
+      </w:r>
+      <w:bookmarkEnd w:id="112"/>
     </w:p>
     <w:p>
       <w:pPr>
@@ -5429,11 +6157,11 @@
       <w:pPr>
         <w:pStyle w:val="Heading1"/>
       </w:pPr>
-      <w:bookmarkStart w:id="112" w:name="_Toc300012"/>
-      <w:r>
-        <w:t>Слайд 12 · Гра: Бонус</w:t>
-      </w:r>
-      <w:bookmarkEnd w:id="112"/>
+      <w:bookmarkStart w:id="113" w:name="_Toc300013"/>
+      <w:r>
+        <w:t>Слайд 13 · Гра: Бонус</w:t>
+      </w:r>
+      <w:bookmarkEnd w:id="113"/>
     </w:p>
     <w:p>
       <w:pPr>
@@ -5943,11 +6671,11 @@
       <w:pPr>
         <w:pStyle w:val="Heading1"/>
       </w:pPr>
-      <w:bookmarkStart w:id="113" w:name="_Toc300013"/>
-      <w:r>
-        <w:t>Слайд 13 · Запам’ятай</w:t>
-      </w:r>
-      <w:bookmarkEnd w:id="113"/>
+      <w:bookmarkStart w:id="114" w:name="_Toc300014"/>
+      <w:r>
+        <w:t>Слайд 14 · Запам’ятай</w:t>
+      </w:r>
+      <w:bookmarkEnd w:id="114"/>
     </w:p>
     <w:p>
       <w:pPr>
@@ -6231,11 +6959,11 @@
       <w:pPr>
         <w:pStyle w:val="Heading1"/>
       </w:pPr>
-      <w:bookmarkStart w:id="114" w:name="_Toc300014"/>
-      <w:r>
-        <w:t>Слайд 14 · Посвідчення програміста</w:t>
-      </w:r>
-      <w:bookmarkEnd w:id="114"/>
+      <w:bookmarkStart w:id="115" w:name="_Toc300015"/>
+      <w:r>
+        <w:t>Слайд 15 · Посвідчення програміста</w:t>
+      </w:r>
+      <w:bookmarkEnd w:id="115"/>
     </w:p>
     <w:p>
       <w:pPr>
@@ -6250,7 +6978,7 @@
         <w:spacing w:after="120" w:line="300" w:lineRule="auto"/>
       </w:pPr>
       <w:r>
-        <w:t xml:space="preserve">Учень пише своє ім’я, бачить 11 бейджів уроку (штампів за слайди) і суму зірок у грі (з 39 можливих: 13 рівнів × 3). Під фото Біта є позначка «Майстер циклів»: вона загоряється, коли пройдено всі три набори рівнів: «Коридори», «Візерунки» й «Вкладені».</w:t>
+        <w:t xml:space="preserve">Учень пише своє ім’я, бачить 12 бейджів уроку (штампів за слайди) і суму зірок у грі (з 39 можливих: 13 рівнів × 3). Під фото Біта є позначка «Майстер циклів»: вона загоряється, коли пройдено всі три набори рівнів: «Коридори», «Візерунки» й «Вкладені».</w:t>
       </w:r>
     </w:p>
     <w:p>
@@ -6298,7 +7026,7 @@
         <w:spacing w:after="120" w:line="300" w:lineRule="auto"/>
       </w:pPr>
       <w:r>
-        <w:t xml:space="preserve">ПОВТОР, РОЗМИНКА, ПАМ’ЯТЬ, ЦИКЛ, МІЛЬЯРД, ЛІЧИЛЬНИК, НАЗАВЖДИ, ПЕРЕВІРКА, КОРИДОРИ, ВІЗЕРУНКИ, ВКЛАДЕНІ.</w:t>
+        <w:t xml:space="preserve">ПОВТОР, РОЗМИНКА, ПАМ’ЯТЬ, БАЙТ, ЦИКЛ, МІЛЬЯРД, ЛІЧИЛЬНИК, НАЗАВЖДИ, ПЕРЕВІРКА, КОРИДОРИ, ВІЗЕРУНКИ, ВКЛАДЕНІ.</w:t>
       </w:r>
     </w:p>
     <w:p>
@@ -6415,11 +7143,11 @@
       <w:pPr>
         <w:pStyle w:val="Heading1"/>
       </w:pPr>
-      <w:bookmarkStart w:id="115" w:name="_Toc300015"/>
+      <w:bookmarkStart w:id="116" w:name="_Toc300016"/>
       <w:r>
         <w:t>Розв’язки рівнів</w:t>
       </w:r>
-      <w:bookmarkEnd w:id="115"/>
+      <w:bookmarkEnd w:id="116"/>
     </w:p>
     <w:p>
       <w:pPr>
@@ -7615,11 +8343,11 @@
       <w:pPr>
         <w:pStyle w:val="Heading1"/>
       </w:pPr>
-      <w:bookmarkStart w:id="116" w:name="_Toc300016"/>
+      <w:bookmarkStart w:id="117" w:name="_Toc300017"/>
       <w:r>
         <w:t>Словничок</w:t>
       </w:r>
-      <w:bookmarkEnd w:id="116"/>
+      <w:bookmarkEnd w:id="117"/>
     </w:p>
     <w:tbl>
       <w:tblPr>

</xml_diff>